<commit_message>
Update Roman's Summer 2025 goals.docx
</commit_message>
<xml_diff>
--- a/Roman's Summer 2025 goals.docx
+++ b/Roman's Summer 2025 goals.docx
@@ -1,8 +1,8 @@
 
 <file path=word/document.xml><?xml version="1.0" encoding="utf-8"?>
-<w:document xmlns:wpc="http://schemas.microsoft.com/office/word/2010/wordprocessingCanvas" xmlns:mc="http://schemas.openxmlformats.org/markup-compatibility/2006" xmlns:o="urn:schemas-microsoft-com:office:office" xmlns:r="http://schemas.openxmlformats.org/officeDocument/2006/relationships" xmlns:m="http://schemas.openxmlformats.org/officeDocument/2006/math" xmlns:v="urn:schemas-microsoft-com:vml" xmlns:wp14="http://schemas.microsoft.com/office/word/2010/wordprocessingDrawing" xmlns:wp="http://schemas.openxmlformats.org/drawingml/2006/wordprocessingDrawing" xmlns:w10="urn:schemas-microsoft-com:office:word" xmlns:w="http://schemas.openxmlformats.org/wordprocessingml/2006/main" xmlns:w14="http://schemas.microsoft.com/office/word/2010/wordml" xmlns:w15="http://schemas.microsoft.com/office/word/2012/wordml" xmlns:wpg="http://schemas.microsoft.com/office/word/2010/wordprocessingGroup" xmlns:wpi="http://schemas.microsoft.com/office/word/2010/wordprocessingInk" xmlns:wne="http://schemas.microsoft.com/office/word/2006/wordml" xmlns:wps="http://schemas.microsoft.com/office/word/2010/wordprocessingShape" xmlns:w16se="http://schemas.microsoft.com/office/word/2015/wordml/symex" xmlns:w16cid="http://schemas.microsoft.com/office/word/2016/wordml/cid" xmlns:w16="http://schemas.microsoft.com/office/word/2018/wordml" xmlns:w16cex="http://schemas.microsoft.com/office/word/2018/wordml/cex" xmlns:w16sdtdh="http://schemas.microsoft.com/office/word/2020/wordml/sdtdatahash" xmlns:w16sdtfl="http://schemas.microsoft.com/office/word/2024/wordml/sdtformatlock" mc:Ignorable="w14 w15 wp14 w16se w16cid w16 w16cex w16sdtdh w16sdtfl">
+<w:document xmlns:wpc="http://schemas.microsoft.com/office/word/2010/wordprocessingCanvas" xmlns:cx="http://schemas.microsoft.com/office/drawing/2014/chartex" xmlns:cx1="http://schemas.microsoft.com/office/drawing/2015/9/8/chartex" xmlns:cx2="http://schemas.microsoft.com/office/drawing/2015/10/21/chartex" xmlns:cx3="http://schemas.microsoft.com/office/drawing/2016/5/9/chartex" xmlns:cx4="http://schemas.microsoft.com/office/drawing/2016/5/10/chartex" xmlns:cx5="http://schemas.microsoft.com/office/drawing/2016/5/11/chartex" xmlns:cx6="http://schemas.microsoft.com/office/drawing/2016/5/12/chartex" xmlns:cx7="http://schemas.microsoft.com/office/drawing/2016/5/13/chartex" xmlns:cx8="http://schemas.microsoft.com/office/drawing/2016/5/14/chartex" xmlns:mc="http://schemas.openxmlformats.org/markup-compatibility/2006" xmlns:aink="http://schemas.microsoft.com/office/drawing/2016/ink" xmlns:am3d="http://schemas.microsoft.com/office/drawing/2017/model3d" xmlns:o="urn:schemas-microsoft-com:office:office" xmlns:oel="http://schemas.microsoft.com/office/2019/extlst" xmlns:r="http://schemas.openxmlformats.org/officeDocument/2006/relationships" xmlns:m="http://schemas.openxmlformats.org/officeDocument/2006/math" xmlns:v="urn:schemas-microsoft-com:vml" xmlns:wp14="http://schemas.microsoft.com/office/word/2010/wordprocessingDrawing" xmlns:wp="http://schemas.openxmlformats.org/drawingml/2006/wordprocessingDrawing" xmlns:w10="urn:schemas-microsoft-com:office:word" xmlns:w="http://schemas.openxmlformats.org/wordprocessingml/2006/main" xmlns:w14="http://schemas.microsoft.com/office/word/2010/wordml" xmlns:w15="http://schemas.microsoft.com/office/word/2012/wordml" xmlns:w16cex="http://schemas.microsoft.com/office/word/2018/wordml/cex" xmlns:w16cid="http://schemas.microsoft.com/office/word/2016/wordml/cid" xmlns:w16="http://schemas.microsoft.com/office/word/2018/wordml" xmlns:w16du="http://schemas.microsoft.com/office/word/2023/wordml/word16du" xmlns:w16sdtdh="http://schemas.microsoft.com/office/word/2020/wordml/sdtdatahash" xmlns:w16sdtfl="http://schemas.microsoft.com/office/word/2024/wordml/sdtformatlock" xmlns:w16se="http://schemas.microsoft.com/office/word/2015/wordml/symex" xmlns:wpg="http://schemas.microsoft.com/office/word/2010/wordprocessingGroup" xmlns:wpi="http://schemas.microsoft.com/office/word/2010/wordprocessingInk" xmlns:wne="http://schemas.microsoft.com/office/word/2006/wordml" xmlns:wps="http://schemas.microsoft.com/office/word/2010/wordprocessingShape" mc:Ignorable="w14 w15 w16se w16cid w16 w16cex w16sdtdh w16sdtfl w16du wp14">
   <w:body>
-    <w:p xmlns:wp14="http://schemas.microsoft.com/office/word/2010/wordml" wp14:paraId="2C078E63" wp14:textId="18A495F1">
+    <w:p>
       <w:pPr>
         <w:pStyle w:val="ListParagraph"/>
         <w:numPr>
@@ -10,32 +10,50 @@
           <w:numId w:val="1"/>
         </w:numPr>
         <w:rPr>
-          <w:rFonts w:ascii="Times New Roman" w:hAnsi="Times New Roman" w:eastAsia="Times New Roman" w:cs="Times New Roman"/>
-        </w:rPr>
-      </w:pPr>
-      <w:r>
-        <w:rPr>
-          <w:rFonts w:ascii="Times New Roman" w:hAnsi="Times New Roman" w:eastAsia="Times New Roman" w:cs="Times New Roman"/>
+          <w:rFonts w:ascii="Times New Roman" w:eastAsia="Times New Roman" w:hAnsi="Times New Roman" w:cs="Times New Roman"/>
+        </w:rPr>
+      </w:pPr>
+      <w:r>
+        <w:rPr>
+          <w:rFonts w:ascii="Times New Roman" w:eastAsia="Times New Roman" w:hAnsi="Times New Roman" w:cs="Times New Roman"/>
         </w:rPr>
         <w:t xml:space="preserve">Feel like </w:t>
       </w:r>
       <w:r>
         <w:rPr>
-          <w:rFonts w:ascii="Times New Roman" w:hAnsi="Times New Roman" w:eastAsia="Times New Roman" w:cs="Times New Roman"/>
-        </w:rPr>
-        <w:t xml:space="preserve">a master at R and R studio by the </w:t>
-      </w:r>
-      <w:r>
-        <w:rPr>
-          <w:rFonts w:ascii="Times New Roman" w:hAnsi="Times New Roman" w:eastAsia="Times New Roman" w:cs="Times New Roman"/>
-        </w:rPr>
-        <w:t>en</w:t>
-      </w:r>
-      <w:r>
-        <w:rPr>
-          <w:rFonts w:ascii="Times New Roman" w:hAnsi="Times New Roman" w:eastAsia="Times New Roman" w:cs="Times New Roman"/>
-        </w:rPr>
-        <w:t xml:space="preserve">d of the summer </w:t>
+          <w:rFonts w:ascii="Times New Roman" w:eastAsia="Times New Roman" w:hAnsi="Times New Roman" w:cs="Times New Roman"/>
+        </w:rPr>
+        <w:t xml:space="preserve">a master at R and R studio by the end of the summer </w:t>
+      </w:r>
+    </w:p>
+    <w:p>
+      <w:pPr>
+        <w:ind w:left="360"/>
+        <w:rPr>
+          <w:rFonts w:ascii="Times New Roman" w:eastAsia="Times New Roman" w:hAnsi="Times New Roman" w:cs="Times New Roman"/>
+          <w:color w:val="0070C0"/>
+        </w:rPr>
+      </w:pPr>
+      <w:r>
+        <w:rPr>
+          <w:rFonts w:ascii="Times New Roman" w:eastAsia="Times New Roman" w:hAnsi="Times New Roman" w:cs="Times New Roman"/>
+          <w:color w:val="0070C0"/>
+        </w:rPr>
+        <w:t xml:space="preserve">Mastering R and RStudio is a lifelong journey. I'm always refining my own skills, learning new tricks, and picking up insights from others. But you're well on your way, and I'm sure after a few more </w:t>
+      </w:r>
+      <w:r>
+        <w:rPr>
+          <w:rFonts w:ascii="Times New Roman" w:eastAsia="Times New Roman" w:hAnsi="Times New Roman" w:cs="Times New Roman"/>
+          <w:color w:val="0070C0"/>
+        </w:rPr>
+        <w:t>weeks</w:t>
+      </w:r>
+      <w:r>
+        <w:rPr>
+          <w:rFonts w:ascii="Times New Roman" w:eastAsia="Times New Roman" w:hAnsi="Times New Roman" w:cs="Times New Roman"/>
+          <w:color w:val="0070C0"/>
+        </w:rPr>
+        <w:t xml:space="preserve"> of focused coding, you'll be even stronger.</w:t>
       </w:r>
     </w:p>
     <w:p>
@@ -46,32 +64,49 @@
           <w:numId w:val="1"/>
         </w:numPr>
         <w:rPr>
-          <w:rFonts w:ascii="Times New Roman" w:hAnsi="Times New Roman" w:eastAsia="Times New Roman" w:cs="Times New Roman"/>
-        </w:rPr>
-      </w:pPr>
-      <w:r>
-        <w:rPr>
-          <w:rFonts w:ascii="Times New Roman" w:hAnsi="Times New Roman" w:eastAsia="Times New Roman" w:cs="Times New Roman"/>
+          <w:rFonts w:ascii="Times New Roman" w:eastAsia="Times New Roman" w:hAnsi="Times New Roman" w:cs="Times New Roman"/>
+        </w:rPr>
+      </w:pPr>
+      <w:r>
+        <w:rPr>
+          <w:rFonts w:ascii="Times New Roman" w:eastAsia="Times New Roman" w:hAnsi="Times New Roman" w:cs="Times New Roman"/>
         </w:rPr>
         <w:t xml:space="preserve">Be able to communicate well about the project </w:t>
       </w:r>
       <w:r>
         <w:rPr>
-          <w:rFonts w:ascii="Times New Roman" w:hAnsi="Times New Roman" w:eastAsia="Times New Roman" w:cs="Times New Roman"/>
-        </w:rPr>
-        <w:t xml:space="preserve">to my </w:t>
-      </w:r>
-      <w:r>
-        <w:rPr>
-          <w:rFonts w:ascii="Times New Roman" w:hAnsi="Times New Roman" w:eastAsia="Times New Roman" w:cs="Times New Roman"/>
-        </w:rPr>
-        <w:t>colleagues</w:t>
-      </w:r>
-      <w:r>
-        <w:rPr>
-          <w:rFonts w:ascii="Times New Roman" w:hAnsi="Times New Roman" w:eastAsia="Times New Roman" w:cs="Times New Roman"/>
-        </w:rPr>
-        <w:t xml:space="preserve"> and mentors </w:t>
+          <w:rFonts w:ascii="Times New Roman" w:eastAsia="Times New Roman" w:hAnsi="Times New Roman" w:cs="Times New Roman"/>
+        </w:rPr>
+        <w:t>to my colleagues and mentors</w:t>
+      </w:r>
+    </w:p>
+    <w:p>
+      <w:pPr>
+        <w:ind w:left="360"/>
+        <w:rPr>
+          <w:rFonts w:ascii="Times New Roman" w:eastAsia="Times New Roman" w:hAnsi="Times New Roman" w:cs="Times New Roman"/>
+        </w:rPr>
+      </w:pPr>
+      <w:r>
+        <w:rPr>
+          <w:rFonts w:ascii="Times New Roman" w:eastAsia="Times New Roman" w:hAnsi="Times New Roman" w:cs="Times New Roman"/>
+          <w:color w:val="0070C0"/>
+        </w:rPr>
+        <w:t>You’re doing great at this. I think the first step in scientific communication is being able to articulate thoughtful questions</w:t>
+      </w:r>
+      <w:r>
+        <w:rPr>
+          <w:rFonts w:ascii="Times New Roman" w:eastAsia="Times New Roman" w:hAnsi="Times New Roman" w:cs="Times New Roman"/>
+          <w:color w:val="0070C0"/>
+        </w:rPr>
+        <w:t>…</w:t>
+      </w:r>
+      <w:r>
+        <w:rPr>
+          <w:rFonts w:ascii="Times New Roman" w:eastAsia="Times New Roman" w:hAnsi="Times New Roman" w:cs="Times New Roman"/>
+          <w:color w:val="0070C0"/>
+        </w:rPr>
+        <w:t>and all the questions you've brought to me have been communicated very well.</w:t>
       </w:r>
     </w:p>
     <w:p>
@@ -82,14 +117,30 @@
           <w:numId w:val="1"/>
         </w:numPr>
         <w:rPr>
-          <w:rFonts w:ascii="Times New Roman" w:hAnsi="Times New Roman" w:eastAsia="Times New Roman" w:cs="Times New Roman"/>
-        </w:rPr>
-      </w:pPr>
-      <w:r>
-        <w:rPr>
-          <w:rFonts w:ascii="Times New Roman" w:hAnsi="Times New Roman" w:eastAsia="Times New Roman" w:cs="Times New Roman"/>
-        </w:rPr>
-        <w:t xml:space="preserve">Have my name entered as an author into a manuscript to prayerfully be published in the future </w:t>
+          <w:rFonts w:ascii="Times New Roman" w:eastAsia="Times New Roman" w:hAnsi="Times New Roman" w:cs="Times New Roman"/>
+        </w:rPr>
+      </w:pPr>
+      <w:r>
+        <w:rPr>
+          <w:rFonts w:ascii="Times New Roman" w:eastAsia="Times New Roman" w:hAnsi="Times New Roman" w:cs="Times New Roman"/>
+        </w:rPr>
+        <w:t>Have my name entered as an author into a manuscript to prayerfully be published in the future</w:t>
+      </w:r>
+    </w:p>
+    <w:p>
+      <w:pPr>
+        <w:ind w:left="360"/>
+        <w:rPr>
+          <w:rFonts w:ascii="Times New Roman" w:eastAsia="Times New Roman" w:hAnsi="Times New Roman" w:cs="Times New Roman"/>
+          <w:color w:val="0070C0"/>
+        </w:rPr>
+      </w:pPr>
+      <w:r>
+        <w:rPr>
+          <w:rFonts w:ascii="Times New Roman" w:eastAsia="Times New Roman" w:hAnsi="Times New Roman" w:cs="Times New Roman"/>
+          <w:color w:val="0070C0"/>
+        </w:rPr>
+        <w:t>Manifesting it. Bet</w:t>
       </w:r>
     </w:p>
     <w:p>
@@ -100,20 +151,62 @@
           <w:numId w:val="1"/>
         </w:numPr>
         <w:rPr>
-          <w:rFonts w:ascii="Times New Roman" w:hAnsi="Times New Roman" w:eastAsia="Times New Roman" w:cs="Times New Roman"/>
-        </w:rPr>
-      </w:pPr>
-      <w:r>
-        <w:rPr>
-          <w:rFonts w:ascii="Times New Roman" w:hAnsi="Times New Roman" w:eastAsia="Times New Roman" w:cs="Times New Roman"/>
+          <w:rFonts w:ascii="Times New Roman" w:eastAsia="Times New Roman" w:hAnsi="Times New Roman" w:cs="Times New Roman"/>
+        </w:rPr>
+      </w:pPr>
+      <w:r>
+        <w:rPr>
+          <w:rFonts w:ascii="Times New Roman" w:eastAsia="Times New Roman" w:hAnsi="Times New Roman" w:cs="Times New Roman"/>
         </w:rPr>
         <w:t>Feel more confident</w:t>
       </w:r>
       <w:r>
         <w:rPr>
-          <w:rFonts w:ascii="Times New Roman" w:hAnsi="Times New Roman" w:eastAsia="Times New Roman" w:cs="Times New Roman"/>
-        </w:rPr>
-        <w:t xml:space="preserve"> with answering questions and presenting papers </w:t>
+          <w:rFonts w:ascii="Times New Roman" w:eastAsia="Times New Roman" w:hAnsi="Times New Roman" w:cs="Times New Roman"/>
+        </w:rPr>
+        <w:t xml:space="preserve"> with answering questions and presenting papers</w:t>
+      </w:r>
+    </w:p>
+    <w:p>
+      <w:pPr>
+        <w:ind w:left="360"/>
+        <w:rPr>
+          <w:rFonts w:ascii="Times New Roman" w:eastAsia="Times New Roman" w:hAnsi="Times New Roman" w:cs="Times New Roman"/>
+        </w:rPr>
+      </w:pPr>
+      <w:r>
+        <w:rPr>
+          <w:rFonts w:ascii="Times New Roman" w:eastAsia="Times New Roman" w:hAnsi="Times New Roman" w:cs="Times New Roman"/>
+          <w:color w:val="0070C0"/>
+        </w:rPr>
+        <w:t>This is another lifelong journey. It’s about committing to mastering your subject and becoming comfortable with it over time. And just as important is knowing the limits of your knowledge</w:t>
+      </w:r>
+      <w:r>
+        <w:rPr>
+          <w:rFonts w:ascii="Times New Roman" w:eastAsia="Times New Roman" w:hAnsi="Times New Roman" w:cs="Times New Roman"/>
+          <w:color w:val="0070C0"/>
+        </w:rPr>
+        <w:t>…</w:t>
+      </w:r>
+      <w:r>
+        <w:rPr>
+          <w:rFonts w:ascii="Times New Roman" w:eastAsia="Times New Roman" w:hAnsi="Times New Roman" w:cs="Times New Roman"/>
+          <w:color w:val="0070C0"/>
+        </w:rPr>
+        <w:t>and being confident enough to acknowledge them. You're already making progress</w:t>
+      </w:r>
+      <w:r>
+        <w:rPr>
+          <w:rFonts w:ascii="Times New Roman" w:eastAsia="Times New Roman" w:hAnsi="Times New Roman" w:cs="Times New Roman"/>
+          <w:color w:val="0070C0"/>
+        </w:rPr>
+        <w:t xml:space="preserve">. </w:t>
+      </w:r>
+      <w:r>
+        <w:rPr>
+          <w:rFonts w:ascii="Times New Roman" w:eastAsia="Times New Roman" w:hAnsi="Times New Roman" w:cs="Times New Roman"/>
+        </w:rPr>
+        <w:t xml:space="preserve"> </w:t>
       </w:r>
     </w:p>
     <w:p>
@@ -124,18 +217,91 @@
           <w:numId w:val="1"/>
         </w:numPr>
         <w:rPr>
-          <w:rFonts w:ascii="Times New Roman" w:hAnsi="Times New Roman" w:eastAsia="Times New Roman" w:cs="Times New Roman"/>
-        </w:rPr>
-      </w:pPr>
-      <w:r>
-        <w:rPr>
-          <w:rFonts w:ascii="Times New Roman" w:hAnsi="Times New Roman" w:eastAsia="Times New Roman" w:cs="Times New Roman"/>
+          <w:rFonts w:ascii="Times New Roman" w:eastAsia="Times New Roman" w:hAnsi="Times New Roman" w:cs="Times New Roman"/>
+        </w:rPr>
+      </w:pPr>
+      <w:r>
+        <w:rPr>
+          <w:rFonts w:ascii="Times New Roman" w:eastAsia="Times New Roman" w:hAnsi="Times New Roman" w:cs="Times New Roman"/>
         </w:rPr>
         <w:t xml:space="preserve">Bring my learned skills back to my lab at Vanderbilt in the fall </w:t>
       </w:r>
+    </w:p>
+    <w:p>
+      <w:pPr>
+        <w:ind w:left="360"/>
+        <w:rPr>
+          <w:rFonts w:ascii="Times New Roman" w:eastAsia="Times New Roman" w:hAnsi="Times New Roman" w:cs="Times New Roman"/>
+          <w:color w:val="0070C0"/>
+        </w:rPr>
+      </w:pPr>
+      <w:r>
+        <w:rPr>
+          <w:rFonts w:ascii="Times New Roman" w:eastAsia="Times New Roman" w:hAnsi="Times New Roman" w:cs="Times New Roman"/>
+          <w:color w:val="0070C0"/>
+        </w:rPr>
+        <w:t>This is one of my goals too. I'll be here to help in any way I can. Plus, your kidney snRNA-seq skills are going to be really valuable to the kidney research community at Vanderbilt</w:t>
+      </w:r>
+      <w:r>
+        <w:rPr>
+          <w:rFonts w:ascii="Times New Roman" w:eastAsia="Times New Roman" w:hAnsi="Times New Roman" w:cs="Times New Roman"/>
+          <w:color w:val="0070C0"/>
+        </w:rPr>
+        <w:t xml:space="preserve"> …researchers</w:t>
+      </w:r>
+      <w:r>
+        <w:rPr>
+          <w:rFonts w:ascii="Times New Roman" w:eastAsia="Times New Roman" w:hAnsi="Times New Roman" w:cs="Times New Roman"/>
+          <w:color w:val="0070C0"/>
+        </w:rPr>
+        <w:t xml:space="preserve"> like Andy Terker and Eric Delpire will definitely appreciate your </w:t>
+      </w:r>
+      <w:r>
+        <w:rPr>
+          <w:rFonts w:ascii="Times New Roman" w:eastAsia="Times New Roman" w:hAnsi="Times New Roman" w:cs="Times New Roman"/>
+          <w:color w:val="0070C0"/>
+        </w:rPr>
+        <w:t>skillset!</w:t>
+      </w:r>
+    </w:p>
+    <w:p>
+      <w:pPr>
+        <w:rPr>
+          <w:rFonts w:ascii="Times New Roman" w:eastAsia="Times New Roman" w:hAnsi="Times New Roman" w:cs="Times New Roman"/>
+          <w:color w:val="0070C0"/>
+        </w:rPr>
+      </w:pPr>
+      <w:r>
+        <w:rPr>
+          <w:rFonts w:ascii="Times New Roman" w:eastAsia="Times New Roman" w:hAnsi="Times New Roman" w:cs="Times New Roman"/>
+          <w:color w:val="0070C0"/>
+        </w:rPr>
+        <w:t xml:space="preserve">JWN </w:t>
+      </w:r>
+      <w:r>
+        <w:rPr>
+          <w:rFonts w:ascii="Times New Roman" w:eastAsia="Times New Roman" w:hAnsi="Times New Roman" w:cs="Times New Roman"/>
+          <w:color w:val="0070C0"/>
+        </w:rPr>
+        <w:t>7.5</w:t>
+      </w:r>
+      <w:r>
+        <w:rPr>
+          <w:rFonts w:ascii="Times New Roman" w:eastAsia="Times New Roman" w:hAnsi="Times New Roman" w:cs="Times New Roman"/>
+          <w:color w:val="0070C0"/>
+        </w:rPr>
+        <w:t>.25</w:t>
+      </w:r>
+    </w:p>
+    <w:p>
+      <w:pPr>
+        <w:rPr>
+          <w:rFonts w:ascii="Times New Roman" w:eastAsia="Times New Roman" w:hAnsi="Times New Roman" w:cs="Times New Roman"/>
+        </w:rPr>
+      </w:pPr>
     </w:p>
     <w:sectPr>
-      <w:pgSz w:w="12240" w:h="15840" w:orient="portrait"/>
+      <w:pgSz w:w="12240" w:h="15840"/>
       <w:pgMar w:top="1440" w:right="1440" w:bottom="1440" w:left="1440" w:header="720" w:footer="720" w:gutter="0"/>
       <w:cols w:space="720"/>
       <w:docGrid w:linePitch="360"/>
@@ -145,11 +311,12 @@
 </file>
 
 <file path=word/numbering.xml><?xml version="1.0" encoding="utf-8"?>
-<w:numbering xmlns:w="http://schemas.openxmlformats.org/wordprocessingml/2006/main">
-  <w:abstractNum xmlns:w="http://schemas.openxmlformats.org/wordprocessingml/2006/main" w:abstractNumId="1">
-    <w:nsid w:val="12a24d16"/>
-    <w:multiLevelType xmlns:w="http://schemas.openxmlformats.org/wordprocessingml/2006/main" w:val="hybridMultilevel"/>
-    <w:lvl xmlns:w="http://schemas.openxmlformats.org/wordprocessingml/2006/main" w:ilvl="0">
+<w:numbering xmlns:wpc="http://schemas.microsoft.com/office/word/2010/wordprocessingCanvas" xmlns:cx="http://schemas.microsoft.com/office/drawing/2014/chartex" xmlns:cx1="http://schemas.microsoft.com/office/drawing/2015/9/8/chartex" xmlns:cx2="http://schemas.microsoft.com/office/drawing/2015/10/21/chartex" xmlns:cx3="http://schemas.microsoft.com/office/drawing/2016/5/9/chartex" xmlns:cx4="http://schemas.microsoft.com/office/drawing/2016/5/10/chartex" xmlns:cx5="http://schemas.microsoft.com/office/drawing/2016/5/11/chartex" xmlns:cx6="http://schemas.microsoft.com/office/drawing/2016/5/12/chartex" xmlns:cx7="http://schemas.microsoft.com/office/drawing/2016/5/13/chartex" xmlns:cx8="http://schemas.microsoft.com/office/drawing/2016/5/14/chartex" xmlns:mc="http://schemas.openxmlformats.org/markup-compatibility/2006" xmlns:aink="http://schemas.microsoft.com/office/drawing/2016/ink" xmlns:am3d="http://schemas.microsoft.com/office/drawing/2017/model3d" xmlns:o="urn:schemas-microsoft-com:office:office" xmlns:oel="http://schemas.microsoft.com/office/2019/extlst" xmlns:r="http://schemas.openxmlformats.org/officeDocument/2006/relationships" xmlns:m="http://schemas.openxmlformats.org/officeDocument/2006/math" xmlns:v="urn:schemas-microsoft-com:vml" xmlns:wp14="http://schemas.microsoft.com/office/word/2010/wordprocessingDrawing" xmlns:wp="http://schemas.openxmlformats.org/drawingml/2006/wordprocessingDrawing" xmlns:w10="urn:schemas-microsoft-com:office:word" xmlns:w="http://schemas.openxmlformats.org/wordprocessingml/2006/main" xmlns:w14="http://schemas.microsoft.com/office/word/2010/wordml" xmlns:w15="http://schemas.microsoft.com/office/word/2012/wordml" xmlns:w16cex="http://schemas.microsoft.com/office/word/2018/wordml/cex" xmlns:w16cid="http://schemas.microsoft.com/office/word/2016/wordml/cid" xmlns:w16="http://schemas.microsoft.com/office/word/2018/wordml" xmlns:w16du="http://schemas.microsoft.com/office/word/2023/wordml/word16du" xmlns:w16sdtdh="http://schemas.microsoft.com/office/word/2020/wordml/sdtdatahash" xmlns:w16sdtfl="http://schemas.microsoft.com/office/word/2024/wordml/sdtformatlock" xmlns:w16se="http://schemas.microsoft.com/office/word/2015/wordml/symex" xmlns:wpg="http://schemas.microsoft.com/office/word/2010/wordprocessingGroup" xmlns:wpi="http://schemas.microsoft.com/office/word/2010/wordprocessingInk" xmlns:wne="http://schemas.microsoft.com/office/word/2006/wordml" xmlns:wps="http://schemas.microsoft.com/office/word/2010/wordprocessingShape" mc:Ignorable="w14 w15 w16se w16cid w16 w16cex w16sdtdh w16sdtfl w16du wp14">
+  <w:abstractNum w:abstractNumId="0" w15:restartNumberingAfterBreak="0">
+    <w:nsid w:val="12A24D16"/>
+    <w:multiLevelType w:val="hybridMultilevel"/>
+    <w:tmpl w:val="B0D21D22"/>
+    <w:lvl w:ilvl="0" w:tplc="E3BC273A">
       <w:start w:val="1"/>
       <w:numFmt w:val="decimal"/>
       <w:lvlText w:val="%1."/>
@@ -158,7 +325,7 @@
         <w:ind w:left="720" w:hanging="360"/>
       </w:pPr>
     </w:lvl>
-    <w:lvl xmlns:w="http://schemas.openxmlformats.org/wordprocessingml/2006/main" w:ilvl="1">
+    <w:lvl w:ilvl="1" w:tplc="49969594">
       <w:start w:val="1"/>
       <w:numFmt w:val="lowerLetter"/>
       <w:lvlText w:val="%2."/>
@@ -167,7 +334,7 @@
         <w:ind w:left="1440" w:hanging="360"/>
       </w:pPr>
     </w:lvl>
-    <w:lvl xmlns:w="http://schemas.openxmlformats.org/wordprocessingml/2006/main" w:ilvl="2">
+    <w:lvl w:ilvl="2" w:tplc="BC022880">
       <w:start w:val="1"/>
       <w:numFmt w:val="lowerRoman"/>
       <w:lvlText w:val="%3."/>
@@ -176,7 +343,7 @@
         <w:ind w:left="2160" w:hanging="180"/>
       </w:pPr>
     </w:lvl>
-    <w:lvl xmlns:w="http://schemas.openxmlformats.org/wordprocessingml/2006/main" w:ilvl="3">
+    <w:lvl w:ilvl="3" w:tplc="3AE60C8C">
       <w:start w:val="1"/>
       <w:numFmt w:val="decimal"/>
       <w:lvlText w:val="%4."/>
@@ -185,7 +352,7 @@
         <w:ind w:left="2880" w:hanging="360"/>
       </w:pPr>
     </w:lvl>
-    <w:lvl xmlns:w="http://schemas.openxmlformats.org/wordprocessingml/2006/main" w:ilvl="4">
+    <w:lvl w:ilvl="4" w:tplc="9CEC8390">
       <w:start w:val="1"/>
       <w:numFmt w:val="lowerLetter"/>
       <w:lvlText w:val="%5."/>
@@ -194,7 +361,7 @@
         <w:ind w:left="3600" w:hanging="360"/>
       </w:pPr>
     </w:lvl>
-    <w:lvl xmlns:w="http://schemas.openxmlformats.org/wordprocessingml/2006/main" w:ilvl="5">
+    <w:lvl w:ilvl="5" w:tplc="A4FCDF4C">
       <w:start w:val="1"/>
       <w:numFmt w:val="lowerRoman"/>
       <w:lvlText w:val="%6."/>
@@ -203,7 +370,7 @@
         <w:ind w:left="4320" w:hanging="180"/>
       </w:pPr>
     </w:lvl>
-    <w:lvl xmlns:w="http://schemas.openxmlformats.org/wordprocessingml/2006/main" w:ilvl="6">
+    <w:lvl w:ilvl="6" w:tplc="078CCBDE">
       <w:start w:val="1"/>
       <w:numFmt w:val="decimal"/>
       <w:lvlText w:val="%7."/>
@@ -212,7 +379,7 @@
         <w:ind w:left="5040" w:hanging="360"/>
       </w:pPr>
     </w:lvl>
-    <w:lvl xmlns:w="http://schemas.openxmlformats.org/wordprocessingml/2006/main" w:ilvl="7">
+    <w:lvl w:ilvl="7" w:tplc="C17A095E">
       <w:start w:val="1"/>
       <w:numFmt w:val="lowerLetter"/>
       <w:lvlText w:val="%8."/>
@@ -221,7 +388,7 @@
         <w:ind w:left="5760" w:hanging="360"/>
       </w:pPr>
     </w:lvl>
-    <w:lvl xmlns:w="http://schemas.openxmlformats.org/wordprocessingml/2006/main" w:ilvl="8">
+    <w:lvl w:ilvl="8" w:tplc="94ECBF40">
       <w:start w:val="1"/>
       <w:numFmt w:val="lowerRoman"/>
       <w:lvlText w:val="%9."/>
@@ -231,18 +398,18 @@
       </w:pPr>
     </w:lvl>
   </w:abstractNum>
-  <w:num w:numId="1">
-    <w:abstractNumId w:val="1"/>
+  <w:num w:numId="1" w16cid:durableId="2095198924">
+    <w:abstractNumId w:val="0"/>
   </w:num>
 </w:numbering>
 </file>
 
 <file path=word/styles.xml><?xml version="1.0" encoding="utf-8"?>
-<w:styles xmlns:wp14="http://schemas.microsoft.com/office/word/2010/wordprocessingDrawing" xmlns:mc="http://schemas.openxmlformats.org/markup-compatibility/2006" xmlns:r="http://schemas.openxmlformats.org/officeDocument/2006/relationships" xmlns:w="http://schemas.openxmlformats.org/wordprocessingml/2006/main" xmlns:w14="http://schemas.microsoft.com/office/word/2010/wordml" xmlns:w15="http://schemas.microsoft.com/office/word/2012/wordml" xmlns:w16se="http://schemas.microsoft.com/office/word/2015/wordml/symex" xmlns:w16cid="http://schemas.microsoft.com/office/word/2016/wordml/cid" xmlns:w16="http://schemas.microsoft.com/office/word/2018/wordml" xmlns:w16cex="http://schemas.microsoft.com/office/word/2018/wordml/cex" xmlns:w16sdtdh="http://schemas.microsoft.com/office/word/2020/wordml/sdtdatahash" xmlns:w16sdtfl="http://schemas.microsoft.com/office/word/2024/wordml/sdtformatlock" mc:Ignorable="w14 w15 wp14 w16se w16cid w16 w16cex w16sdtdh w16sdtfl">
+<w:styles xmlns:mc="http://schemas.openxmlformats.org/markup-compatibility/2006" xmlns:r="http://schemas.openxmlformats.org/officeDocument/2006/relationships" xmlns:w="http://schemas.openxmlformats.org/wordprocessingml/2006/main" xmlns:w14="http://schemas.microsoft.com/office/word/2010/wordml" xmlns:w15="http://schemas.microsoft.com/office/word/2012/wordml" xmlns:w16cex="http://schemas.microsoft.com/office/word/2018/wordml/cex" xmlns:w16cid="http://schemas.microsoft.com/office/word/2016/wordml/cid" xmlns:w16="http://schemas.microsoft.com/office/word/2018/wordml" xmlns:w16du="http://schemas.microsoft.com/office/word/2023/wordml/word16du" xmlns:w16sdtdh="http://schemas.microsoft.com/office/word/2020/wordml/sdtdatahash" xmlns:w16sdtfl="http://schemas.microsoft.com/office/word/2024/wordml/sdtformatlock" xmlns:w16se="http://schemas.microsoft.com/office/word/2015/wordml/symex" mc:Ignorable="w14 w15 w16se w16cid w16 w16cex w16sdtdh w16sdtfl w16du">
   <w:docDefaults>
     <w:rPrDefault>
       <w:rPr>
-        <w:rFonts w:asciiTheme="minorHAnsi" w:hAnsiTheme="minorHAnsi" w:eastAsiaTheme="minorEastAsia" w:cstheme="minorBidi"/>
+        <w:rFonts w:asciiTheme="minorHAnsi" w:eastAsiaTheme="minorEastAsia" w:hAnsiTheme="minorHAnsi" w:cstheme="minorBidi"/>
         <w:sz w:val="24"/>
         <w:szCs w:val="24"/>
         <w:lang w:val="en-US" w:eastAsia="ja-JP" w:bidi="ar-SA"/>
@@ -254,17 +421,17 @@
       </w:pPr>
     </w:pPrDefault>
   </w:docDefaults>
-  <w:latentStyles w:defLockedState="0" w:defUIPriority="99" w:defSemiHidden="0" w:defUnhideWhenUsed="0" w:defQFormat="0" w:count="371">
+  <w:latentStyles w:defLockedState="0" w:defUIPriority="99" w:defSemiHidden="0" w:defUnhideWhenUsed="0" w:defQFormat="0" w:count="376">
     <w:lsdException w:name="Normal" w:uiPriority="0" w:qFormat="1"/>
     <w:lsdException w:name="heading 1" w:uiPriority="9" w:qFormat="1"/>
-    <w:lsdException w:name="heading 2" w:uiPriority="9" w:semiHidden="1" w:unhideWhenUsed="1" w:qFormat="1"/>
-    <w:lsdException w:name="heading 3" w:uiPriority="9" w:semiHidden="1" w:unhideWhenUsed="1" w:qFormat="1"/>
-    <w:lsdException w:name="heading 4" w:uiPriority="9" w:semiHidden="1" w:unhideWhenUsed="1" w:qFormat="1"/>
-    <w:lsdException w:name="heading 5" w:uiPriority="9" w:semiHidden="1" w:unhideWhenUsed="1" w:qFormat="1"/>
-    <w:lsdException w:name="heading 6" w:uiPriority="9" w:semiHidden="1" w:unhideWhenUsed="1" w:qFormat="1"/>
-    <w:lsdException w:name="heading 7" w:uiPriority="9" w:semiHidden="1" w:unhideWhenUsed="1" w:qFormat="1"/>
-    <w:lsdException w:name="heading 8" w:uiPriority="9" w:semiHidden="1" w:unhideWhenUsed="1" w:qFormat="1"/>
-    <w:lsdException w:name="heading 9" w:uiPriority="9" w:semiHidden="1" w:unhideWhenUsed="1" w:qFormat="1"/>
+    <w:lsdException w:name="heading 2" w:semiHidden="1" w:uiPriority="9" w:unhideWhenUsed="1" w:qFormat="1"/>
+    <w:lsdException w:name="heading 3" w:semiHidden="1" w:uiPriority="9" w:unhideWhenUsed="1" w:qFormat="1"/>
+    <w:lsdException w:name="heading 4" w:semiHidden="1" w:uiPriority="9" w:unhideWhenUsed="1" w:qFormat="1"/>
+    <w:lsdException w:name="heading 5" w:semiHidden="1" w:uiPriority="9" w:unhideWhenUsed="1" w:qFormat="1"/>
+    <w:lsdException w:name="heading 6" w:semiHidden="1" w:uiPriority="9" w:unhideWhenUsed="1" w:qFormat="1"/>
+    <w:lsdException w:name="heading 7" w:semiHidden="1" w:uiPriority="9" w:unhideWhenUsed="1" w:qFormat="1"/>
+    <w:lsdException w:name="heading 8" w:semiHidden="1" w:uiPriority="9" w:unhideWhenUsed="1" w:qFormat="1"/>
+    <w:lsdException w:name="heading 9" w:semiHidden="1" w:uiPriority="9" w:unhideWhenUsed="1" w:qFormat="1"/>
     <w:lsdException w:name="index 1" w:semiHidden="1" w:unhideWhenUsed="1"/>
     <w:lsdException w:name="index 2" w:semiHidden="1" w:unhideWhenUsed="1"/>
     <w:lsdException w:name="index 3" w:semiHidden="1" w:unhideWhenUsed="1"/>
@@ -274,22 +441,22 @@
     <w:lsdException w:name="index 7" w:semiHidden="1" w:unhideWhenUsed="1"/>
     <w:lsdException w:name="index 8" w:semiHidden="1" w:unhideWhenUsed="1"/>
     <w:lsdException w:name="index 9" w:semiHidden="1" w:unhideWhenUsed="1"/>
-    <w:lsdException w:name="toc 1" w:uiPriority="39" w:semiHidden="1" w:unhideWhenUsed="1"/>
-    <w:lsdException w:name="toc 2" w:uiPriority="39" w:semiHidden="1" w:unhideWhenUsed="1"/>
-    <w:lsdException w:name="toc 3" w:uiPriority="39" w:semiHidden="1" w:unhideWhenUsed="1"/>
-    <w:lsdException w:name="toc 4" w:uiPriority="39" w:semiHidden="1" w:unhideWhenUsed="1"/>
-    <w:lsdException w:name="toc 5" w:uiPriority="39" w:semiHidden="1" w:unhideWhenUsed="1"/>
-    <w:lsdException w:name="toc 6" w:uiPriority="39" w:semiHidden="1" w:unhideWhenUsed="1"/>
-    <w:lsdException w:name="toc 7" w:uiPriority="39" w:semiHidden="1" w:unhideWhenUsed="1"/>
-    <w:lsdException w:name="toc 8" w:uiPriority="39" w:semiHidden="1" w:unhideWhenUsed="1"/>
-    <w:lsdException w:name="toc 9" w:uiPriority="39" w:semiHidden="1" w:unhideWhenUsed="1"/>
+    <w:lsdException w:name="toc 1" w:semiHidden="1" w:uiPriority="39" w:unhideWhenUsed="1"/>
+    <w:lsdException w:name="toc 2" w:semiHidden="1" w:uiPriority="39" w:unhideWhenUsed="1"/>
+    <w:lsdException w:name="toc 3" w:semiHidden="1" w:uiPriority="39" w:unhideWhenUsed="1"/>
+    <w:lsdException w:name="toc 4" w:semiHidden="1" w:uiPriority="39" w:unhideWhenUsed="1"/>
+    <w:lsdException w:name="toc 5" w:semiHidden="1" w:uiPriority="39" w:unhideWhenUsed="1"/>
+    <w:lsdException w:name="toc 6" w:semiHidden="1" w:uiPriority="39" w:unhideWhenUsed="1"/>
+    <w:lsdException w:name="toc 7" w:semiHidden="1" w:uiPriority="39" w:unhideWhenUsed="1"/>
+    <w:lsdException w:name="toc 8" w:semiHidden="1" w:uiPriority="39" w:unhideWhenUsed="1"/>
+    <w:lsdException w:name="toc 9" w:semiHidden="1" w:uiPriority="39" w:unhideWhenUsed="1"/>
     <w:lsdException w:name="Normal Indent" w:semiHidden="1" w:unhideWhenUsed="1"/>
     <w:lsdException w:name="footnote text" w:semiHidden="1" w:unhideWhenUsed="1"/>
     <w:lsdException w:name="annotation text" w:semiHidden="1" w:unhideWhenUsed="1"/>
     <w:lsdException w:name="header" w:semiHidden="1" w:unhideWhenUsed="1"/>
     <w:lsdException w:name="footer" w:semiHidden="1" w:unhideWhenUsed="1"/>
     <w:lsdException w:name="index heading" w:semiHidden="1" w:unhideWhenUsed="1"/>
-    <w:lsdException w:name="caption" w:uiPriority="35" w:semiHidden="1" w:unhideWhenUsed="1" w:qFormat="1"/>
+    <w:lsdException w:name="caption" w:semiHidden="1" w:uiPriority="35" w:unhideWhenUsed="1" w:qFormat="1"/>
     <w:lsdException w:name="table of figures" w:semiHidden="1" w:unhideWhenUsed="1"/>
     <w:lsdException w:name="envelope address" w:semiHidden="1" w:unhideWhenUsed="1"/>
     <w:lsdException w:name="envelope return" w:semiHidden="1" w:unhideWhenUsed="1"/>
@@ -320,7 +487,7 @@
     <w:lsdException w:name="Title" w:uiPriority="10" w:qFormat="1"/>
     <w:lsdException w:name="Closing" w:semiHidden="1" w:unhideWhenUsed="1"/>
     <w:lsdException w:name="Signature" w:semiHidden="1" w:unhideWhenUsed="1"/>
-    <w:lsdException w:name="Default Paragraph Font" w:uiPriority="1" w:semiHidden="1" w:unhideWhenUsed="1"/>
+    <w:lsdException w:name="Default Paragraph Font" w:semiHidden="1" w:uiPriority="1" w:unhideWhenUsed="1"/>
     <w:lsdException w:name="Body Text" w:semiHidden="1" w:unhideWhenUsed="1"/>
     <w:lsdException w:name="Body Text Indent" w:semiHidden="1" w:unhideWhenUsed="1"/>
     <w:lsdException w:name="List Continue" w:semiHidden="1" w:unhideWhenUsed="1"/>
@@ -520,8 +687,8 @@
     <w:lsdException w:name="Subtle Reference" w:uiPriority="31" w:qFormat="1"/>
     <w:lsdException w:name="Intense Reference" w:uiPriority="32" w:qFormat="1"/>
     <w:lsdException w:name="Book Title" w:uiPriority="33" w:qFormat="1"/>
-    <w:lsdException w:name="Bibliography" w:uiPriority="37" w:semiHidden="1" w:unhideWhenUsed="1"/>
-    <w:lsdException w:name="TOC Heading" w:uiPriority="39" w:semiHidden="1" w:unhideWhenUsed="1" w:qFormat="1"/>
+    <w:lsdException w:name="Bibliography" w:semiHidden="1" w:uiPriority="37" w:unhideWhenUsed="1"/>
+    <w:lsdException w:name="TOC Heading" w:semiHidden="1" w:uiPriority="39" w:unhideWhenUsed="1" w:qFormat="1"/>
     <w:lsdException w:name="Plain Table 1" w:uiPriority="41"/>
     <w:lsdException w:name="Plain Table 2" w:uiPriority="42"/>
     <w:lsdException w:name="Plain Table 3" w:uiPriority="43"/>
@@ -626,18 +793,205 @@
     <w:lsdException w:name="List Table 5 Dark Accent 6" w:uiPriority="50"/>
     <w:lsdException w:name="List Table 6 Colorful Accent 6" w:uiPriority="51"/>
     <w:lsdException w:name="List Table 7 Colorful Accent 6" w:uiPriority="52"/>
+    <w:lsdException w:name="Mention" w:semiHidden="1" w:unhideWhenUsed="1"/>
+    <w:lsdException w:name="Smart Hyperlink" w:semiHidden="1" w:unhideWhenUsed="1"/>
+    <w:lsdException w:name="Hashtag" w:semiHidden="1" w:unhideWhenUsed="1"/>
+    <w:lsdException w:name="Unresolved Mention" w:semiHidden="1" w:unhideWhenUsed="1"/>
+    <w:lsdException w:name="Smart Link" w:semiHidden="1" w:unhideWhenUsed="1"/>
   </w:latentStyles>
-  <w:style w:type="paragraph" w:styleId="Normal" w:default="1">
+  <w:style w:type="paragraph" w:default="1" w:styleId="Normal">
     <w:name w:val="Normal"/>
     <w:qFormat/>
   </w:style>
-  <w:style w:type="character" w:styleId="DefaultParagraphFont" w:default="1">
+  <w:style w:type="paragraph" w:styleId="Heading1">
+    <w:name w:val="heading 1"/>
+    <w:basedOn w:val="Normal"/>
+    <w:next w:val="Normal"/>
+    <w:link w:val="Heading1Char"/>
+    <w:uiPriority w:val="9"/>
+    <w:qFormat/>
+    <w:pPr>
+      <w:keepNext/>
+      <w:keepLines/>
+      <w:spacing w:before="360" w:after="80"/>
+      <w:outlineLvl w:val="0"/>
+    </w:pPr>
+    <w:rPr>
+      <w:rFonts w:asciiTheme="majorHAnsi" w:eastAsiaTheme="majorEastAsia" w:hAnsiTheme="majorHAnsi" w:cstheme="majorBidi"/>
+      <w:color w:val="0F4761" w:themeColor="accent1" w:themeShade="BF"/>
+      <w:sz w:val="40"/>
+      <w:szCs w:val="40"/>
+    </w:rPr>
+  </w:style>
+  <w:style w:type="paragraph" w:styleId="Heading2">
+    <w:name w:val="heading 2"/>
+    <w:basedOn w:val="Normal"/>
+    <w:next w:val="Normal"/>
+    <w:link w:val="Heading2Char"/>
+    <w:uiPriority w:val="9"/>
+    <w:unhideWhenUsed/>
+    <w:qFormat/>
+    <w:pPr>
+      <w:keepNext/>
+      <w:keepLines/>
+      <w:spacing w:before="160" w:after="80"/>
+      <w:outlineLvl w:val="1"/>
+    </w:pPr>
+    <w:rPr>
+      <w:rFonts w:asciiTheme="majorHAnsi" w:eastAsiaTheme="majorEastAsia" w:hAnsiTheme="majorHAnsi" w:cstheme="majorBidi"/>
+      <w:color w:val="0F4761" w:themeColor="accent1" w:themeShade="BF"/>
+      <w:sz w:val="32"/>
+      <w:szCs w:val="32"/>
+    </w:rPr>
+  </w:style>
+  <w:style w:type="paragraph" w:styleId="Heading3">
+    <w:name w:val="heading 3"/>
+    <w:basedOn w:val="Normal"/>
+    <w:next w:val="Normal"/>
+    <w:link w:val="Heading3Char"/>
+    <w:uiPriority w:val="9"/>
+    <w:unhideWhenUsed/>
+    <w:qFormat/>
+    <w:pPr>
+      <w:keepNext/>
+      <w:keepLines/>
+      <w:spacing w:before="160" w:after="80"/>
+      <w:outlineLvl w:val="2"/>
+    </w:pPr>
+    <w:rPr>
+      <w:rFonts w:eastAsiaTheme="majorEastAsia" w:cstheme="majorBidi"/>
+      <w:color w:val="0F4761" w:themeColor="accent1" w:themeShade="BF"/>
+      <w:sz w:val="28"/>
+      <w:szCs w:val="28"/>
+    </w:rPr>
+  </w:style>
+  <w:style w:type="paragraph" w:styleId="Heading4">
+    <w:name w:val="heading 4"/>
+    <w:basedOn w:val="Normal"/>
+    <w:next w:val="Normal"/>
+    <w:link w:val="Heading4Char"/>
+    <w:uiPriority w:val="9"/>
+    <w:unhideWhenUsed/>
+    <w:qFormat/>
+    <w:pPr>
+      <w:keepNext/>
+      <w:keepLines/>
+      <w:spacing w:before="80" w:after="40"/>
+      <w:outlineLvl w:val="3"/>
+    </w:pPr>
+    <w:rPr>
+      <w:rFonts w:eastAsiaTheme="majorEastAsia" w:cstheme="majorBidi"/>
+      <w:i/>
+      <w:iCs/>
+      <w:color w:val="0F4761" w:themeColor="accent1" w:themeShade="BF"/>
+    </w:rPr>
+  </w:style>
+  <w:style w:type="paragraph" w:styleId="Heading5">
+    <w:name w:val="heading 5"/>
+    <w:basedOn w:val="Normal"/>
+    <w:next w:val="Normal"/>
+    <w:link w:val="Heading5Char"/>
+    <w:uiPriority w:val="9"/>
+    <w:unhideWhenUsed/>
+    <w:qFormat/>
+    <w:pPr>
+      <w:keepNext/>
+      <w:keepLines/>
+      <w:spacing w:before="80" w:after="40"/>
+      <w:outlineLvl w:val="4"/>
+    </w:pPr>
+    <w:rPr>
+      <w:rFonts w:eastAsiaTheme="majorEastAsia" w:cstheme="majorBidi"/>
+      <w:color w:val="0F4761" w:themeColor="accent1" w:themeShade="BF"/>
+    </w:rPr>
+  </w:style>
+  <w:style w:type="paragraph" w:styleId="Heading6">
+    <w:name w:val="heading 6"/>
+    <w:basedOn w:val="Normal"/>
+    <w:next w:val="Normal"/>
+    <w:link w:val="Heading6Char"/>
+    <w:uiPriority w:val="9"/>
+    <w:unhideWhenUsed/>
+    <w:qFormat/>
+    <w:pPr>
+      <w:keepNext/>
+      <w:keepLines/>
+      <w:spacing w:before="40" w:after="0"/>
+      <w:outlineLvl w:val="5"/>
+    </w:pPr>
+    <w:rPr>
+      <w:rFonts w:eastAsiaTheme="majorEastAsia" w:cstheme="majorBidi"/>
+      <w:i/>
+      <w:iCs/>
+      <w:color w:val="595959" w:themeColor="text1" w:themeTint="A6"/>
+    </w:rPr>
+  </w:style>
+  <w:style w:type="paragraph" w:styleId="Heading7">
+    <w:name w:val="heading 7"/>
+    <w:basedOn w:val="Normal"/>
+    <w:next w:val="Normal"/>
+    <w:link w:val="Heading7Char"/>
+    <w:uiPriority w:val="9"/>
+    <w:unhideWhenUsed/>
+    <w:qFormat/>
+    <w:pPr>
+      <w:keepNext/>
+      <w:keepLines/>
+      <w:spacing w:before="40" w:after="0"/>
+      <w:outlineLvl w:val="6"/>
+    </w:pPr>
+    <w:rPr>
+      <w:rFonts w:eastAsiaTheme="majorEastAsia" w:cstheme="majorBidi"/>
+      <w:color w:val="595959" w:themeColor="text1" w:themeTint="A6"/>
+    </w:rPr>
+  </w:style>
+  <w:style w:type="paragraph" w:styleId="Heading8">
+    <w:name w:val="heading 8"/>
+    <w:basedOn w:val="Normal"/>
+    <w:next w:val="Normal"/>
+    <w:link w:val="Heading8Char"/>
+    <w:uiPriority w:val="9"/>
+    <w:unhideWhenUsed/>
+    <w:qFormat/>
+    <w:pPr>
+      <w:keepNext/>
+      <w:keepLines/>
+      <w:spacing w:after="0"/>
+      <w:outlineLvl w:val="7"/>
+    </w:pPr>
+    <w:rPr>
+      <w:rFonts w:eastAsiaTheme="majorEastAsia" w:cstheme="majorBidi"/>
+      <w:i/>
+      <w:iCs/>
+      <w:color w:val="272727" w:themeColor="text1" w:themeTint="D8"/>
+    </w:rPr>
+  </w:style>
+  <w:style w:type="paragraph" w:styleId="Heading9">
+    <w:name w:val="heading 9"/>
+    <w:basedOn w:val="Normal"/>
+    <w:next w:val="Normal"/>
+    <w:link w:val="Heading9Char"/>
+    <w:uiPriority w:val="9"/>
+    <w:unhideWhenUsed/>
+    <w:qFormat/>
+    <w:pPr>
+      <w:keepNext/>
+      <w:keepLines/>
+      <w:spacing w:after="0"/>
+      <w:outlineLvl w:val="8"/>
+    </w:pPr>
+    <w:rPr>
+      <w:rFonts w:eastAsiaTheme="majorEastAsia" w:cstheme="majorBidi"/>
+      <w:color w:val="272727" w:themeColor="text1" w:themeTint="D8"/>
+    </w:rPr>
+  </w:style>
+  <w:style w:type="character" w:default="1" w:styleId="DefaultParagraphFont">
     <w:name w:val="Default Paragraph Font"/>
     <w:uiPriority w:val="1"/>
     <w:semiHidden/>
     <w:unhideWhenUsed/>
   </w:style>
-  <w:style w:type="table" w:styleId="TableNormal" w:default="1">
+  <w:style w:type="table" w:default="1" w:styleId="TableNormal">
     <w:name w:val="Normal Table"/>
     <w:uiPriority w:val="99"/>
     <w:semiHidden/>
@@ -652,78 +1006,37 @@
       </w:tblCellMar>
     </w:tblPr>
   </w:style>
-  <w:style w:type="numbering" w:styleId="NoList" w:default="1">
+  <w:style w:type="numbering" w:default="1" w:styleId="NoList">
     <w:name w:val="No List"/>
     <w:uiPriority w:val="99"/>
     <w:semiHidden/>
     <w:unhideWhenUsed/>
   </w:style>
-  <w:style w:type="character" w:styleId="Heading1Char" w:customStyle="1">
+  <w:style w:type="character" w:customStyle="1" w:styleId="Heading1Char">
     <w:name w:val="Heading 1 Char"/>
     <w:basedOn w:val="DefaultParagraphFont"/>
     <w:link w:val="Heading1"/>
     <w:uiPriority w:val="9"/>
     <w:rPr>
-      <w:rFonts w:asciiTheme="majorHAnsi" w:hAnsiTheme="majorHAnsi" w:eastAsiaTheme="majorEastAsia" w:cstheme="majorBidi"/>
+      <w:rFonts w:asciiTheme="majorHAnsi" w:eastAsiaTheme="majorEastAsia" w:hAnsiTheme="majorHAnsi" w:cstheme="majorBidi"/>
       <w:color w:val="0F4761" w:themeColor="accent1" w:themeShade="BF"/>
       <w:sz w:val="40"/>
       <w:szCs w:val="40"/>
     </w:rPr>
   </w:style>
-  <w:style w:type="paragraph" w:styleId="Heading1">
-    <w:name w:val="heading 1"/>
-    <w:basedOn w:val="Normal"/>
-    <w:next w:val="Normal"/>
-    <w:link w:val="Heading1Char"/>
-    <w:uiPriority w:val="9"/>
-    <w:qFormat/>
-    <w:pPr>
-      <w:keepNext/>
-      <w:keepLines/>
-      <w:spacing w:before="360" w:after="80"/>
-      <w:outlineLvl w:val="0"/>
-    </w:pPr>
-    <w:rPr>
-      <w:rFonts w:asciiTheme="majorHAnsi" w:hAnsiTheme="majorHAnsi" w:eastAsiaTheme="majorEastAsia" w:cstheme="majorBidi"/>
-      <w:color w:val="0F4761" w:themeColor="accent1" w:themeShade="BF"/>
-      <w:sz w:val="40"/>
-      <w:szCs w:val="40"/>
-    </w:rPr>
-  </w:style>
-  <w:style w:type="character" w:styleId="Heading2Char" w:customStyle="1">
+  <w:style w:type="character" w:customStyle="1" w:styleId="Heading2Char">
     <w:name w:val="Heading 2 Char"/>
     <w:basedOn w:val="DefaultParagraphFont"/>
     <w:link w:val="Heading2"/>
     <w:uiPriority w:val="9"/>
     <w:rPr>
-      <w:rFonts w:asciiTheme="majorHAnsi" w:hAnsiTheme="majorHAnsi" w:eastAsiaTheme="majorEastAsia" w:cstheme="majorBidi"/>
+      <w:rFonts w:asciiTheme="majorHAnsi" w:eastAsiaTheme="majorEastAsia" w:hAnsiTheme="majorHAnsi" w:cstheme="majorBidi"/>
       <w:color w:val="0F4761" w:themeColor="accent1" w:themeShade="BF"/>
       <w:sz w:val="32"/>
       <w:szCs w:val="32"/>
     </w:rPr>
   </w:style>
-  <w:style w:type="paragraph" w:styleId="Heading2">
-    <w:name w:val="heading 2"/>
-    <w:basedOn w:val="Normal"/>
-    <w:next w:val="Normal"/>
-    <w:link w:val="Heading2Char"/>
-    <w:uiPriority w:val="9"/>
-    <w:unhideWhenUsed/>
-    <w:qFormat/>
-    <w:pPr>
-      <w:keepNext/>
-      <w:keepLines/>
-      <w:spacing w:before="160" w:after="80"/>
-      <w:outlineLvl w:val="1"/>
-    </w:pPr>
-    <w:rPr>
-      <w:rFonts w:asciiTheme="majorHAnsi" w:hAnsiTheme="majorHAnsi" w:eastAsiaTheme="majorEastAsia" w:cstheme="majorBidi"/>
-      <w:color w:val="0F4761" w:themeColor="accent1" w:themeShade="BF"/>
-      <w:sz w:val="32"/>
-      <w:szCs w:val="32"/>
-    </w:rPr>
-  </w:style>
-  <w:style w:type="character" w:styleId="Heading3Char" w:customStyle="1">
+  <w:style w:type="character" w:customStyle="1" w:styleId="Heading3Char">
     <w:name w:val="Heading 3 Char"/>
     <w:basedOn w:val="DefaultParagraphFont"/>
     <w:link w:val="Heading3"/>
@@ -735,28 +1048,7 @@
       <w:szCs w:val="28"/>
     </w:rPr>
   </w:style>
-  <w:style w:type="paragraph" w:styleId="Heading3">
-    <w:name w:val="heading 3"/>
-    <w:basedOn w:val="Normal"/>
-    <w:next w:val="Normal"/>
-    <w:link w:val="Heading3Char"/>
-    <w:uiPriority w:val="9"/>
-    <w:unhideWhenUsed/>
-    <w:qFormat/>
-    <w:pPr>
-      <w:keepNext/>
-      <w:keepLines/>
-      <w:spacing w:before="160" w:after="80"/>
-      <w:outlineLvl w:val="2"/>
-    </w:pPr>
-    <w:rPr>
-      <w:rFonts w:eastAsiaTheme="majorEastAsia" w:cstheme="majorBidi"/>
-      <w:color w:val="0F4761" w:themeColor="accent1" w:themeShade="BF"/>
-      <w:sz w:val="28"/>
-      <w:szCs w:val="28"/>
-    </w:rPr>
-  </w:style>
-  <w:style w:type="character" w:styleId="Heading4Char" w:customStyle="1">
+  <w:style w:type="character" w:customStyle="1" w:styleId="Heading4Char">
     <w:name w:val="Heading 4 Char"/>
     <w:basedOn w:val="DefaultParagraphFont"/>
     <w:link w:val="Heading4"/>
@@ -768,28 +1060,7 @@
       <w:color w:val="0F4761" w:themeColor="accent1" w:themeShade="BF"/>
     </w:rPr>
   </w:style>
-  <w:style w:type="paragraph" w:styleId="Heading4">
-    <w:name w:val="heading 4"/>
-    <w:basedOn w:val="Normal"/>
-    <w:next w:val="Normal"/>
-    <w:link w:val="Heading4Char"/>
-    <w:uiPriority w:val="9"/>
-    <w:unhideWhenUsed/>
-    <w:qFormat/>
-    <w:pPr>
-      <w:keepNext/>
-      <w:keepLines/>
-      <w:spacing w:before="80" w:after="40"/>
-      <w:outlineLvl w:val="3"/>
-    </w:pPr>
-    <w:rPr>
-      <w:rFonts w:eastAsiaTheme="majorEastAsia" w:cstheme="majorBidi"/>
-      <w:i/>
-      <w:iCs/>
-      <w:color w:val="0F4761" w:themeColor="accent1" w:themeShade="BF"/>
-    </w:rPr>
-  </w:style>
-  <w:style w:type="character" w:styleId="Heading5Char" w:customStyle="1">
+  <w:style w:type="character" w:customStyle="1" w:styleId="Heading5Char">
     <w:name w:val="Heading 5 Char"/>
     <w:basedOn w:val="DefaultParagraphFont"/>
     <w:link w:val="Heading5"/>
@@ -799,26 +1070,7 @@
       <w:color w:val="0F4761" w:themeColor="accent1" w:themeShade="BF"/>
     </w:rPr>
   </w:style>
-  <w:style w:type="paragraph" w:styleId="Heading5">
-    <w:name w:val="heading 5"/>
-    <w:basedOn w:val="Normal"/>
-    <w:next w:val="Normal"/>
-    <w:link w:val="Heading5Char"/>
-    <w:uiPriority w:val="9"/>
-    <w:unhideWhenUsed/>
-    <w:qFormat/>
-    <w:pPr>
-      <w:keepNext/>
-      <w:keepLines/>
-      <w:spacing w:before="80" w:after="40"/>
-      <w:outlineLvl w:val="4"/>
-    </w:pPr>
-    <w:rPr>
-      <w:rFonts w:eastAsiaTheme="majorEastAsia" w:cstheme="majorBidi"/>
-      <w:color w:val="0F4761" w:themeColor="accent1" w:themeShade="BF"/>
-    </w:rPr>
-  </w:style>
-  <w:style w:type="character" w:styleId="Heading6Char" w:customStyle="1">
+  <w:style w:type="character" w:customStyle="1" w:styleId="Heading6Char">
     <w:name w:val="Heading 6 Char"/>
     <w:basedOn w:val="DefaultParagraphFont"/>
     <w:link w:val="Heading6"/>
@@ -830,28 +1082,7 @@
       <w:color w:val="595959" w:themeColor="text1" w:themeTint="A6"/>
     </w:rPr>
   </w:style>
-  <w:style w:type="paragraph" w:styleId="Heading6">
-    <w:name w:val="heading 6"/>
-    <w:basedOn w:val="Normal"/>
-    <w:next w:val="Normal"/>
-    <w:link w:val="Heading6Char"/>
-    <w:uiPriority w:val="9"/>
-    <w:unhideWhenUsed/>
-    <w:qFormat/>
-    <w:pPr>
-      <w:keepNext/>
-      <w:keepLines/>
-      <w:spacing w:before="40" w:after="0"/>
-      <w:outlineLvl w:val="5"/>
-    </w:pPr>
-    <w:rPr>
-      <w:rFonts w:eastAsiaTheme="majorEastAsia" w:cstheme="majorBidi"/>
-      <w:i/>
-      <w:iCs/>
-      <w:color w:val="595959" w:themeColor="text1" w:themeTint="A6"/>
-    </w:rPr>
-  </w:style>
-  <w:style w:type="character" w:styleId="Heading7Char" w:customStyle="1">
+  <w:style w:type="character" w:customStyle="1" w:styleId="Heading7Char">
     <w:name w:val="Heading 7 Char"/>
     <w:basedOn w:val="DefaultParagraphFont"/>
     <w:link w:val="Heading7"/>
@@ -861,26 +1092,7 @@
       <w:color w:val="595959" w:themeColor="text1" w:themeTint="A6"/>
     </w:rPr>
   </w:style>
-  <w:style w:type="paragraph" w:styleId="Heading7">
-    <w:name w:val="heading 7"/>
-    <w:basedOn w:val="Normal"/>
-    <w:next w:val="Normal"/>
-    <w:link w:val="Heading7Char"/>
-    <w:uiPriority w:val="9"/>
-    <w:unhideWhenUsed/>
-    <w:qFormat/>
-    <w:pPr>
-      <w:keepNext/>
-      <w:keepLines/>
-      <w:spacing w:before="40" w:after="0"/>
-      <w:outlineLvl w:val="6"/>
-    </w:pPr>
-    <w:rPr>
-      <w:rFonts w:eastAsiaTheme="majorEastAsia" w:cstheme="majorBidi"/>
-      <w:color w:val="595959" w:themeColor="text1" w:themeTint="A6"/>
-    </w:rPr>
-  </w:style>
-  <w:style w:type="character" w:styleId="Heading8Char" w:customStyle="1">
+  <w:style w:type="character" w:customStyle="1" w:styleId="Heading8Char">
     <w:name w:val="Heading 8 Char"/>
     <w:basedOn w:val="DefaultParagraphFont"/>
     <w:link w:val="Heading8"/>
@@ -892,28 +1104,7 @@
       <w:color w:val="272727" w:themeColor="text1" w:themeTint="D8"/>
     </w:rPr>
   </w:style>
-  <w:style w:type="paragraph" w:styleId="Heading8">
-    <w:name w:val="heading 8"/>
-    <w:basedOn w:val="Normal"/>
-    <w:next w:val="Normal"/>
-    <w:link w:val="Heading8Char"/>
-    <w:uiPriority w:val="9"/>
-    <w:unhideWhenUsed/>
-    <w:qFormat/>
-    <w:pPr>
-      <w:keepNext/>
-      <w:keepLines/>
-      <w:spacing w:after="0"/>
-      <w:outlineLvl w:val="7"/>
-    </w:pPr>
-    <w:rPr>
-      <w:rFonts w:eastAsiaTheme="majorEastAsia" w:cstheme="majorBidi"/>
-      <w:i/>
-      <w:iCs/>
-      <w:color w:val="272727" w:themeColor="text1" w:themeTint="D8"/>
-    </w:rPr>
-  </w:style>
-  <w:style w:type="character" w:styleId="Heading9Char" w:customStyle="1">
+  <w:style w:type="character" w:customStyle="1" w:styleId="Heading9Char">
     <w:name w:val="Heading 9 Char"/>
     <w:basedOn w:val="DefaultParagraphFont"/>
     <w:link w:val="Heading9"/>
@@ -923,32 +1114,13 @@
       <w:color w:val="272727" w:themeColor="text1" w:themeTint="D8"/>
     </w:rPr>
   </w:style>
-  <w:style w:type="paragraph" w:styleId="Heading9">
-    <w:name w:val="heading 9"/>
-    <w:basedOn w:val="Normal"/>
-    <w:next w:val="Normal"/>
-    <w:link w:val="Heading9Char"/>
-    <w:uiPriority w:val="9"/>
-    <w:unhideWhenUsed/>
-    <w:qFormat/>
-    <w:pPr>
-      <w:keepNext/>
-      <w:keepLines/>
-      <w:spacing w:after="0"/>
-      <w:outlineLvl w:val="8"/>
-    </w:pPr>
-    <w:rPr>
-      <w:rFonts w:eastAsiaTheme="majorEastAsia" w:cstheme="majorBidi"/>
-      <w:color w:val="272727" w:themeColor="text1" w:themeTint="D8"/>
-    </w:rPr>
-  </w:style>
-  <w:style w:type="character" w:styleId="TitleChar" w:customStyle="1">
+  <w:style w:type="character" w:customStyle="1" w:styleId="TitleChar">
     <w:name w:val="Title Char"/>
     <w:basedOn w:val="DefaultParagraphFont"/>
     <w:link w:val="Title"/>
     <w:uiPriority w:val="10"/>
     <w:rPr>
-      <w:rFonts w:asciiTheme="majorHAnsi" w:hAnsiTheme="majorHAnsi" w:eastAsiaTheme="majorEastAsia" w:cstheme="majorBidi"/>
+      <w:rFonts w:asciiTheme="majorHAnsi" w:eastAsiaTheme="majorEastAsia" w:hAnsiTheme="majorHAnsi" w:cstheme="majorBidi"/>
       <w:spacing w:val="-10"/>
       <w:kern w:val="28"/>
       <w:sz w:val="56"/>
@@ -967,14 +1139,14 @@
       <w:contextualSpacing/>
     </w:pPr>
     <w:rPr>
-      <w:rFonts w:asciiTheme="majorHAnsi" w:hAnsiTheme="majorHAnsi" w:eastAsiaTheme="majorEastAsia" w:cstheme="majorBidi"/>
+      <w:rFonts w:asciiTheme="majorHAnsi" w:eastAsiaTheme="majorEastAsia" w:hAnsiTheme="majorHAnsi" w:cstheme="majorBidi"/>
       <w:spacing w:val="-10"/>
       <w:kern w:val="28"/>
       <w:sz w:val="56"/>
       <w:szCs w:val="56"/>
     </w:rPr>
   </w:style>
-  <w:style w:type="character" w:styleId="SubtitleChar" w:customStyle="1">
+  <w:style w:type="character" w:customStyle="1" w:styleId="SubtitleChar">
     <w:name w:val="Subtitle Char"/>
     <w:basedOn w:val="DefaultParagraphFont"/>
     <w:link w:val="Subtitle"/>
@@ -1018,7 +1190,7 @@
       <w:color w:val="0F4761" w:themeColor="accent1" w:themeShade="BF"/>
     </w:rPr>
   </w:style>
-  <w:style w:type="character" w:styleId="QuoteChar" w:customStyle="1">
+  <w:style w:type="character" w:customStyle="1" w:styleId="QuoteChar">
     <w:name w:val="Quote Char"/>
     <w:basedOn w:val="DefaultParagraphFont"/>
     <w:link w:val="Quote"/>
@@ -1046,7 +1218,7 @@
       <w:color w:val="404040" w:themeColor="text1" w:themeTint="BF"/>
     </w:rPr>
   </w:style>
-  <w:style w:type="character" w:styleId="IntenseQuoteChar" w:customStyle="1">
+  <w:style w:type="character" w:customStyle="1" w:styleId="IntenseQuoteChar">
     <w:name w:val="Intense Quote Char"/>
     <w:basedOn w:val="DefaultParagraphFont"/>
     <w:link w:val="IntenseQuote"/>
@@ -1066,8 +1238,8 @@
     <w:qFormat/>
     <w:pPr>
       <w:pBdr>
-        <w:top w:val="single" w:color="0F4761" w:themeColor="accent1" w:themeShade="BF" w:sz="4" w:space="10"/>
-        <w:bottom w:val="single" w:color="0F4761" w:themeColor="accent1" w:themeShade="BF" w:sz="4" w:space="10"/>
+        <w:top w:val="single" w:sz="4" w:space="10" w:color="0F4761" w:themeColor="accent1" w:themeShade="BF"/>
+        <w:bottom w:val="single" w:sz="4" w:space="10" w:color="0F4761" w:themeColor="accent1" w:themeShade="BF"/>
       </w:pBdr>
       <w:spacing w:before="360" w:after="360"/>
       <w:ind w:left="864" w:right="864"/>
@@ -1093,13 +1265,12 @@
     </w:rPr>
   </w:style>
   <w:style w:type="paragraph" w:styleId="ListParagraph">
-    <w:uiPriority w:val="34"/>
     <w:name w:val="List Paragraph"/>
     <w:basedOn w:val="Normal"/>
+    <w:uiPriority w:val="34"/>
     <w:qFormat/>
     <w:rsid w:val="6713624D"/>
     <w:pPr>
-      <w:spacing/>
       <w:ind w:left="720"/>
       <w:contextualSpacing/>
     </w:pPr>
@@ -1108,7 +1279,7 @@
 </file>
 
 <file path=word/theme/theme1.xml><?xml version="1.0" encoding="utf-8"?>
-<a:theme xmlns:thm15="http://schemas.microsoft.com/office/thememl/2012/main" xmlns:a="http://schemas.openxmlformats.org/drawingml/2006/main" name="Office Theme">
+<a:theme xmlns:a="http://schemas.openxmlformats.org/drawingml/2006/main" name="Office Theme">
   <a:themeElements>
     <a:clrScheme name="Office">
       <a:dk1>

</xml_diff>